<commit_message>
Add Week 5 questions
</commit_message>
<xml_diff>
--- a/questions/EDLD 650 Class 5 Questions.docx
+++ b/questions/EDLD 650 Class 5 Questions.docx
@@ -1,6 +1,6 @@
 
 <file path=word/document.xml><?xml version="1.0" encoding="utf-8"?>
-<w:document xmlns:wpc="http://schemas.microsoft.com/office/word/2010/wordprocessingCanvas" xmlns:cx="http://schemas.microsoft.com/office/drawing/2014/chartex" xmlns:cx1="http://schemas.microsoft.com/office/drawing/2015/9/8/chartex" xmlns:cx2="http://schemas.microsoft.com/office/drawing/2015/10/21/chartex" xmlns:cx3="http://schemas.microsoft.com/office/drawing/2016/5/9/chartex" xmlns:cx4="http://schemas.microsoft.com/office/drawing/2016/5/10/chartex" xmlns:cx5="http://schemas.microsoft.com/office/drawing/2016/5/11/chartex" xmlns:cx6="http://schemas.microsoft.com/office/drawing/2016/5/12/chartex" xmlns:cx7="http://schemas.microsoft.com/office/drawing/2016/5/13/chartex" xmlns:cx8="http://schemas.microsoft.com/office/drawing/2016/5/14/chartex" xmlns:mc="http://schemas.openxmlformats.org/markup-compatibility/2006" xmlns:aink="http://schemas.microsoft.com/office/drawing/2016/ink" xmlns:am3d="http://schemas.microsoft.com/office/drawing/2017/model3d" xmlns:o="urn:schemas-microsoft-com:office:office" xmlns:oel="http://schemas.microsoft.com/office/2019/extlst" xmlns:r="http://schemas.openxmlformats.org/officeDocument/2006/relationships" xmlns:m="http://schemas.openxmlformats.org/officeDocument/2006/math" xmlns:v="urn:schemas-microsoft-com:vml" xmlns:wp14="http://schemas.microsoft.com/office/word/2010/wordprocessingDrawing" xmlns:wp="http://schemas.openxmlformats.org/drawingml/2006/wordprocessingDrawing" xmlns:w10="urn:schemas-microsoft-com:office:word" xmlns:w="http://schemas.openxmlformats.org/wordprocessingml/2006/main" xmlns:w14="http://schemas.microsoft.com/office/word/2010/wordml" xmlns:w15="http://schemas.microsoft.com/office/word/2012/wordml" xmlns:w16cex="http://schemas.microsoft.com/office/word/2018/wordml/cex" xmlns:w16cid="http://schemas.microsoft.com/office/word/2016/wordml/cid" xmlns:w16="http://schemas.microsoft.com/office/word/2018/wordml" xmlns:w16sdtdh="http://schemas.microsoft.com/office/word/2020/wordml/sdtdatahash" xmlns:w16se="http://schemas.microsoft.com/office/word/2015/wordml/symex" xmlns:wpg="http://schemas.microsoft.com/office/word/2010/wordprocessingGroup" xmlns:wpi="http://schemas.microsoft.com/office/word/2010/wordprocessingInk" xmlns:wne="http://schemas.microsoft.com/office/word/2006/wordml" xmlns:wps="http://schemas.microsoft.com/office/word/2010/wordprocessingShape" mc:Ignorable="w14 w15 w16se w16cid w16 w16cex w16sdtdh wp14">
+<w:document xmlns:wpc="http://schemas.microsoft.com/office/word/2010/wordprocessingCanvas" xmlns:cx="http://schemas.microsoft.com/office/drawing/2014/chartex" xmlns:cx1="http://schemas.microsoft.com/office/drawing/2015/9/8/chartex" xmlns:cx2="http://schemas.microsoft.com/office/drawing/2015/10/21/chartex" xmlns:cx3="http://schemas.microsoft.com/office/drawing/2016/5/9/chartex" xmlns:cx4="http://schemas.microsoft.com/office/drawing/2016/5/10/chartex" xmlns:cx5="http://schemas.microsoft.com/office/drawing/2016/5/11/chartex" xmlns:cx6="http://schemas.microsoft.com/office/drawing/2016/5/12/chartex" xmlns:cx7="http://schemas.microsoft.com/office/drawing/2016/5/13/chartex" xmlns:cx8="http://schemas.microsoft.com/office/drawing/2016/5/14/chartex" xmlns:mc="http://schemas.openxmlformats.org/markup-compatibility/2006" xmlns:aink="http://schemas.microsoft.com/office/drawing/2016/ink" xmlns:am3d="http://schemas.microsoft.com/office/drawing/2017/model3d" xmlns:o="urn:schemas-microsoft-com:office:office" xmlns:oel="http://schemas.microsoft.com/office/2019/extlst" xmlns:r="http://schemas.openxmlformats.org/officeDocument/2006/relationships" xmlns:m="http://schemas.openxmlformats.org/officeDocument/2006/math" xmlns:v="urn:schemas-microsoft-com:vml" xmlns:wp14="http://schemas.microsoft.com/office/word/2010/wordprocessingDrawing" xmlns:wp="http://schemas.openxmlformats.org/drawingml/2006/wordprocessingDrawing" xmlns:w10="urn:schemas-microsoft-com:office:word" xmlns:w="http://schemas.openxmlformats.org/wordprocessingml/2006/main" xmlns:w14="http://schemas.microsoft.com/office/word/2010/wordml" xmlns:w15="http://schemas.microsoft.com/office/word/2012/wordml" xmlns:w16cex="http://schemas.microsoft.com/office/word/2018/wordml/cex" xmlns:w16cid="http://schemas.microsoft.com/office/word/2016/wordml/cid" xmlns:w16="http://schemas.microsoft.com/office/word/2018/wordml" xmlns:w16du="http://schemas.microsoft.com/office/word/2023/wordml/word16du" xmlns:w16sdtdh="http://schemas.microsoft.com/office/word/2020/wordml/sdtdatahash" xmlns:w16sdtfl="http://schemas.microsoft.com/office/word/2024/wordml/sdtformatlock" xmlns:w16se="http://schemas.microsoft.com/office/word/2015/wordml/symex" xmlns:wpg="http://schemas.microsoft.com/office/word/2010/wordprocessingGroup" xmlns:wpi="http://schemas.microsoft.com/office/word/2010/wordprocessingInk" xmlns:wne="http://schemas.microsoft.com/office/word/2006/wordml" xmlns:wps="http://schemas.microsoft.com/office/word/2010/wordprocessingShape" mc:Ignorable="w14 w15 w16se w16cid w16 w16cex w16sdtdh w16sdtfl w16du wp14">
   <w:body>
     <w:p>
       <w:pPr>
@@ -215,21 +215,7 @@
         <w:rPr>
           <w:rFonts w:ascii="Times New Roman" w:hAnsi="Times New Roman" w:cs="Times New Roman"/>
         </w:rPr>
-        <w:t xml:space="preserve">For Holden’s main outcome, he takes the mean scale score for each </w:t>
-      </w:r>
-      <w:proofErr w:type="gramStart"/>
-      <w:r>
-        <w:rPr>
-          <w:rFonts w:ascii="Times New Roman" w:hAnsi="Times New Roman" w:cs="Times New Roman"/>
-        </w:rPr>
-        <w:t>school-year</w:t>
-      </w:r>
-      <w:proofErr w:type="gramEnd"/>
-      <w:r>
-        <w:rPr>
-          <w:rFonts w:ascii="Times New Roman" w:hAnsi="Times New Roman" w:cs="Times New Roman"/>
-        </w:rPr>
-        <w:t xml:space="preserve"> in math and reading and subtracts the sample mean and standard deviation for that year. This gives him a standardized score in math and reading. He then constructs the primary outcome variable </w:t>
+        <w:t xml:space="preserve">For Holden’s main outcome, he takes the mean scale score for each school-year in math and reading and subtracts the sample mean and standard deviation for that year. This gives him a standardized score in math and reading. He then constructs the primary outcome variable </w:t>
       </w:r>
       <w:r>
         <w:rPr>
@@ -539,21 +525,7 @@
         <w:rPr>
           <w:rFonts w:ascii="Times New Roman" w:hAnsi="Times New Roman" w:cs="Times New Roman"/>
         </w:rPr>
-        <w:t xml:space="preserve">Describe the magnitude of Holden’s preferred estimates. How big of an effect did </w:t>
-      </w:r>
-      <w:proofErr w:type="gramStart"/>
-      <w:r>
-        <w:rPr>
-          <w:rFonts w:ascii="Times New Roman" w:hAnsi="Times New Roman" w:cs="Times New Roman"/>
-        </w:rPr>
-        <w:t>increased</w:t>
-      </w:r>
-      <w:proofErr w:type="gramEnd"/>
-      <w:r>
-        <w:rPr>
-          <w:rFonts w:ascii="Times New Roman" w:hAnsi="Times New Roman" w:cs="Times New Roman"/>
-        </w:rPr>
-        <w:t xml:space="preserve"> textbook funding have? How much did it cost? Do the magnitude of the effects seem plausible to you?</w:t>
+        <w:t>Describe the magnitude of Holden’s preferred estimates. How big of an effect did increased textbook funding have? How much did it cost? Do the magnitude of the effects seem plausible to you?</w:t>
       </w:r>
     </w:p>
     <w:p>
@@ -749,7 +721,7 @@
 </file>
 
 <file path=word/endnotes.xml><?xml version="1.0" encoding="utf-8"?>
-<w:endnotes xmlns:wpc="http://schemas.microsoft.com/office/word/2010/wordprocessingCanvas" xmlns:cx="http://schemas.microsoft.com/office/drawing/2014/chartex" xmlns:cx1="http://schemas.microsoft.com/office/drawing/2015/9/8/chartex" xmlns:cx2="http://schemas.microsoft.com/office/drawing/2015/10/21/chartex" xmlns:cx3="http://schemas.microsoft.com/office/drawing/2016/5/9/chartex" xmlns:cx4="http://schemas.microsoft.com/office/drawing/2016/5/10/chartex" xmlns:cx5="http://schemas.microsoft.com/office/drawing/2016/5/11/chartex" xmlns:cx6="http://schemas.microsoft.com/office/drawing/2016/5/12/chartex" xmlns:cx7="http://schemas.microsoft.com/office/drawing/2016/5/13/chartex" xmlns:cx8="http://schemas.microsoft.com/office/drawing/2016/5/14/chartex" xmlns:mc="http://schemas.openxmlformats.org/markup-compatibility/2006" xmlns:aink="http://schemas.microsoft.com/office/drawing/2016/ink" xmlns:am3d="http://schemas.microsoft.com/office/drawing/2017/model3d" xmlns:o="urn:schemas-microsoft-com:office:office" xmlns:oel="http://schemas.microsoft.com/office/2019/extlst" xmlns:r="http://schemas.openxmlformats.org/officeDocument/2006/relationships" xmlns:m="http://schemas.openxmlformats.org/officeDocument/2006/math" xmlns:v="urn:schemas-microsoft-com:vml" xmlns:wp14="http://schemas.microsoft.com/office/word/2010/wordprocessingDrawing" xmlns:wp="http://schemas.openxmlformats.org/drawingml/2006/wordprocessingDrawing" xmlns:w10="urn:schemas-microsoft-com:office:word" xmlns:w="http://schemas.openxmlformats.org/wordprocessingml/2006/main" xmlns:w14="http://schemas.microsoft.com/office/word/2010/wordml" xmlns:w15="http://schemas.microsoft.com/office/word/2012/wordml" xmlns:w16cex="http://schemas.microsoft.com/office/word/2018/wordml/cex" xmlns:w16cid="http://schemas.microsoft.com/office/word/2016/wordml/cid" xmlns:w16="http://schemas.microsoft.com/office/word/2018/wordml" xmlns:w16sdtdh="http://schemas.microsoft.com/office/word/2020/wordml/sdtdatahash" xmlns:w16se="http://schemas.microsoft.com/office/word/2015/wordml/symex" xmlns:wpg="http://schemas.microsoft.com/office/word/2010/wordprocessingGroup" xmlns:wpi="http://schemas.microsoft.com/office/word/2010/wordprocessingInk" xmlns:wne="http://schemas.microsoft.com/office/word/2006/wordml" xmlns:wps="http://schemas.microsoft.com/office/word/2010/wordprocessingShape" mc:Ignorable="w14 w15 w16se w16cid w16 w16cex w16sdtdh wp14">
+<w:endnotes xmlns:wpc="http://schemas.microsoft.com/office/word/2010/wordprocessingCanvas" xmlns:cx="http://schemas.microsoft.com/office/drawing/2014/chartex" xmlns:cx1="http://schemas.microsoft.com/office/drawing/2015/9/8/chartex" xmlns:cx2="http://schemas.microsoft.com/office/drawing/2015/10/21/chartex" xmlns:cx3="http://schemas.microsoft.com/office/drawing/2016/5/9/chartex" xmlns:cx4="http://schemas.microsoft.com/office/drawing/2016/5/10/chartex" xmlns:cx5="http://schemas.microsoft.com/office/drawing/2016/5/11/chartex" xmlns:cx6="http://schemas.microsoft.com/office/drawing/2016/5/12/chartex" xmlns:cx7="http://schemas.microsoft.com/office/drawing/2016/5/13/chartex" xmlns:cx8="http://schemas.microsoft.com/office/drawing/2016/5/14/chartex" xmlns:mc="http://schemas.openxmlformats.org/markup-compatibility/2006" xmlns:aink="http://schemas.microsoft.com/office/drawing/2016/ink" xmlns:am3d="http://schemas.microsoft.com/office/drawing/2017/model3d" xmlns:o="urn:schemas-microsoft-com:office:office" xmlns:oel="http://schemas.microsoft.com/office/2019/extlst" xmlns:r="http://schemas.openxmlformats.org/officeDocument/2006/relationships" xmlns:m="http://schemas.openxmlformats.org/officeDocument/2006/math" xmlns:v="urn:schemas-microsoft-com:vml" xmlns:wp14="http://schemas.microsoft.com/office/word/2010/wordprocessingDrawing" xmlns:wp="http://schemas.openxmlformats.org/drawingml/2006/wordprocessingDrawing" xmlns:w10="urn:schemas-microsoft-com:office:word" xmlns:w="http://schemas.openxmlformats.org/wordprocessingml/2006/main" xmlns:w14="http://schemas.microsoft.com/office/word/2010/wordml" xmlns:w15="http://schemas.microsoft.com/office/word/2012/wordml" xmlns:w16cex="http://schemas.microsoft.com/office/word/2018/wordml/cex" xmlns:w16cid="http://schemas.microsoft.com/office/word/2016/wordml/cid" xmlns:w16="http://schemas.microsoft.com/office/word/2018/wordml" xmlns:w16du="http://schemas.microsoft.com/office/word/2023/wordml/word16du" xmlns:w16sdtdh="http://schemas.microsoft.com/office/word/2020/wordml/sdtdatahash" xmlns:w16sdtfl="http://schemas.microsoft.com/office/word/2024/wordml/sdtformatlock" xmlns:w16se="http://schemas.microsoft.com/office/word/2015/wordml/symex" xmlns:wpg="http://schemas.microsoft.com/office/word/2010/wordprocessingGroup" xmlns:wpi="http://schemas.microsoft.com/office/word/2010/wordprocessingInk" xmlns:wne="http://schemas.microsoft.com/office/word/2006/wordml" xmlns:wps="http://schemas.microsoft.com/office/word/2010/wordprocessingShape" mc:Ignorable="w14 w15 w16se w16cid w16 w16cex w16sdtdh w16sdtfl w16du wp14">
   <w:endnote w:type="separator" w:id="-1">
     <w:p>
       <w:pPr>
@@ -774,7 +746,7 @@
 </file>
 
 <file path=word/footnotes.xml><?xml version="1.0" encoding="utf-8"?>
-<w:footnotes xmlns:wpc="http://schemas.microsoft.com/office/word/2010/wordprocessingCanvas" xmlns:cx="http://schemas.microsoft.com/office/drawing/2014/chartex" xmlns:cx1="http://schemas.microsoft.com/office/drawing/2015/9/8/chartex" xmlns:cx2="http://schemas.microsoft.com/office/drawing/2015/10/21/chartex" xmlns:cx3="http://schemas.microsoft.com/office/drawing/2016/5/9/chartex" xmlns:cx4="http://schemas.microsoft.com/office/drawing/2016/5/10/chartex" xmlns:cx5="http://schemas.microsoft.com/office/drawing/2016/5/11/chartex" xmlns:cx6="http://schemas.microsoft.com/office/drawing/2016/5/12/chartex" xmlns:cx7="http://schemas.microsoft.com/office/drawing/2016/5/13/chartex" xmlns:cx8="http://schemas.microsoft.com/office/drawing/2016/5/14/chartex" xmlns:mc="http://schemas.openxmlformats.org/markup-compatibility/2006" xmlns:aink="http://schemas.microsoft.com/office/drawing/2016/ink" xmlns:am3d="http://schemas.microsoft.com/office/drawing/2017/model3d" xmlns:o="urn:schemas-microsoft-com:office:office" xmlns:oel="http://schemas.microsoft.com/office/2019/extlst" xmlns:r="http://schemas.openxmlformats.org/officeDocument/2006/relationships" xmlns:m="http://schemas.openxmlformats.org/officeDocument/2006/math" xmlns:v="urn:schemas-microsoft-com:vml" xmlns:wp14="http://schemas.microsoft.com/office/word/2010/wordprocessingDrawing" xmlns:wp="http://schemas.openxmlformats.org/drawingml/2006/wordprocessingDrawing" xmlns:w10="urn:schemas-microsoft-com:office:word" xmlns:w="http://schemas.openxmlformats.org/wordprocessingml/2006/main" xmlns:w14="http://schemas.microsoft.com/office/word/2010/wordml" xmlns:w15="http://schemas.microsoft.com/office/word/2012/wordml" xmlns:w16cex="http://schemas.microsoft.com/office/word/2018/wordml/cex" xmlns:w16cid="http://schemas.microsoft.com/office/word/2016/wordml/cid" xmlns:w16="http://schemas.microsoft.com/office/word/2018/wordml" xmlns:w16sdtdh="http://schemas.microsoft.com/office/word/2020/wordml/sdtdatahash" xmlns:w16se="http://schemas.microsoft.com/office/word/2015/wordml/symex" xmlns:wpg="http://schemas.microsoft.com/office/word/2010/wordprocessingGroup" xmlns:wpi="http://schemas.microsoft.com/office/word/2010/wordprocessingInk" xmlns:wne="http://schemas.microsoft.com/office/word/2006/wordml" xmlns:wps="http://schemas.microsoft.com/office/word/2010/wordprocessingShape" mc:Ignorable="w14 w15 w16se w16cid w16 w16cex w16sdtdh wp14">
+<w:footnotes xmlns:wpc="http://schemas.microsoft.com/office/word/2010/wordprocessingCanvas" xmlns:cx="http://schemas.microsoft.com/office/drawing/2014/chartex" xmlns:cx1="http://schemas.microsoft.com/office/drawing/2015/9/8/chartex" xmlns:cx2="http://schemas.microsoft.com/office/drawing/2015/10/21/chartex" xmlns:cx3="http://schemas.microsoft.com/office/drawing/2016/5/9/chartex" xmlns:cx4="http://schemas.microsoft.com/office/drawing/2016/5/10/chartex" xmlns:cx5="http://schemas.microsoft.com/office/drawing/2016/5/11/chartex" xmlns:cx6="http://schemas.microsoft.com/office/drawing/2016/5/12/chartex" xmlns:cx7="http://schemas.microsoft.com/office/drawing/2016/5/13/chartex" xmlns:cx8="http://schemas.microsoft.com/office/drawing/2016/5/14/chartex" xmlns:mc="http://schemas.openxmlformats.org/markup-compatibility/2006" xmlns:aink="http://schemas.microsoft.com/office/drawing/2016/ink" xmlns:am3d="http://schemas.microsoft.com/office/drawing/2017/model3d" xmlns:o="urn:schemas-microsoft-com:office:office" xmlns:oel="http://schemas.microsoft.com/office/2019/extlst" xmlns:r="http://schemas.openxmlformats.org/officeDocument/2006/relationships" xmlns:m="http://schemas.openxmlformats.org/officeDocument/2006/math" xmlns:v="urn:schemas-microsoft-com:vml" xmlns:wp14="http://schemas.microsoft.com/office/word/2010/wordprocessingDrawing" xmlns:wp="http://schemas.openxmlformats.org/drawingml/2006/wordprocessingDrawing" xmlns:w10="urn:schemas-microsoft-com:office:word" xmlns:w="http://schemas.openxmlformats.org/wordprocessingml/2006/main" xmlns:w14="http://schemas.microsoft.com/office/word/2010/wordml" xmlns:w15="http://schemas.microsoft.com/office/word/2012/wordml" xmlns:w16cex="http://schemas.microsoft.com/office/word/2018/wordml/cex" xmlns:w16cid="http://schemas.microsoft.com/office/word/2016/wordml/cid" xmlns:w16="http://schemas.microsoft.com/office/word/2018/wordml" xmlns:w16du="http://schemas.microsoft.com/office/word/2023/wordml/word16du" xmlns:w16sdtdh="http://schemas.microsoft.com/office/word/2020/wordml/sdtdatahash" xmlns:w16sdtfl="http://schemas.microsoft.com/office/word/2024/wordml/sdtformatlock" xmlns:w16se="http://schemas.microsoft.com/office/word/2015/wordml/symex" xmlns:wpg="http://schemas.microsoft.com/office/word/2010/wordprocessingGroup" xmlns:wpi="http://schemas.microsoft.com/office/word/2010/wordprocessingInk" xmlns:wne="http://schemas.microsoft.com/office/word/2006/wordml" xmlns:wps="http://schemas.microsoft.com/office/word/2010/wordprocessingShape" mc:Ignorable="w14 w15 w16se w16cid w16 w16cex w16sdtdh w16sdtfl w16du wp14">
   <w:footnote w:type="separator" w:id="-1">
     <w:p>
       <w:pPr>
@@ -813,7 +785,19 @@
         <w:rPr>
           <w:rFonts w:ascii="Times New Roman" w:hAnsi="Times New Roman" w:cs="Times New Roman"/>
         </w:rPr>
-        <w:t xml:space="preserve">He does not describe how he selects this bandwidth other than to reference the authors (Calonico, Cattaneo &amp; Titiunik, 2014) of the Stata package </w:t>
+        <w:t>He does not describe how he selects this bandwidth other than to reference the authors (Calonico, Cattaneo &amp; Titiunik, 2014) of the Stata</w:t>
+      </w:r>
+      <w:r>
+        <w:rPr>
+          <w:rFonts w:ascii="Times New Roman" w:hAnsi="Times New Roman" w:cs="Times New Roman"/>
+        </w:rPr>
+        <w:t>/R</w:t>
+      </w:r>
+      <w:r>
+        <w:rPr>
+          <w:rFonts w:ascii="Times New Roman" w:hAnsi="Times New Roman" w:cs="Times New Roman"/>
+        </w:rPr>
+        <w:t xml:space="preserve"> package </w:t>
       </w:r>
       <w:r>
         <w:rPr>
@@ -834,7 +818,7 @@
 </file>
 
 <file path=word/numbering.xml><?xml version="1.0" encoding="utf-8"?>
-<w:numbering xmlns:wpc="http://schemas.microsoft.com/office/word/2010/wordprocessingCanvas" xmlns:cx="http://schemas.microsoft.com/office/drawing/2014/chartex" xmlns:cx1="http://schemas.microsoft.com/office/drawing/2015/9/8/chartex" xmlns:cx2="http://schemas.microsoft.com/office/drawing/2015/10/21/chartex" xmlns:cx3="http://schemas.microsoft.com/office/drawing/2016/5/9/chartex" xmlns:cx4="http://schemas.microsoft.com/office/drawing/2016/5/10/chartex" xmlns:cx5="http://schemas.microsoft.com/office/drawing/2016/5/11/chartex" xmlns:cx6="http://schemas.microsoft.com/office/drawing/2016/5/12/chartex" xmlns:cx7="http://schemas.microsoft.com/office/drawing/2016/5/13/chartex" xmlns:cx8="http://schemas.microsoft.com/office/drawing/2016/5/14/chartex" xmlns:mc="http://schemas.openxmlformats.org/markup-compatibility/2006" xmlns:aink="http://schemas.microsoft.com/office/drawing/2016/ink" xmlns:am3d="http://schemas.microsoft.com/office/drawing/2017/model3d" xmlns:o="urn:schemas-microsoft-com:office:office" xmlns:oel="http://schemas.microsoft.com/office/2019/extlst" xmlns:r="http://schemas.openxmlformats.org/officeDocument/2006/relationships" xmlns:m="http://schemas.openxmlformats.org/officeDocument/2006/math" xmlns:v="urn:schemas-microsoft-com:vml" xmlns:wp14="http://schemas.microsoft.com/office/word/2010/wordprocessingDrawing" xmlns:wp="http://schemas.openxmlformats.org/drawingml/2006/wordprocessingDrawing" xmlns:w10="urn:schemas-microsoft-com:office:word" xmlns:w="http://schemas.openxmlformats.org/wordprocessingml/2006/main" xmlns:w14="http://schemas.microsoft.com/office/word/2010/wordml" xmlns:w15="http://schemas.microsoft.com/office/word/2012/wordml" xmlns:w16cex="http://schemas.microsoft.com/office/word/2018/wordml/cex" xmlns:w16cid="http://schemas.microsoft.com/office/word/2016/wordml/cid" xmlns:w16="http://schemas.microsoft.com/office/word/2018/wordml" xmlns:w16sdtdh="http://schemas.microsoft.com/office/word/2020/wordml/sdtdatahash" xmlns:w16se="http://schemas.microsoft.com/office/word/2015/wordml/symex" xmlns:wpg="http://schemas.microsoft.com/office/word/2010/wordprocessingGroup" xmlns:wpi="http://schemas.microsoft.com/office/word/2010/wordprocessingInk" xmlns:wne="http://schemas.microsoft.com/office/word/2006/wordml" xmlns:wps="http://schemas.microsoft.com/office/word/2010/wordprocessingShape" mc:Ignorable="w14 w15 w16se w16cid w16 w16cex w16sdtdh wp14">
+<w:numbering xmlns:wpc="http://schemas.microsoft.com/office/word/2010/wordprocessingCanvas" xmlns:cx="http://schemas.microsoft.com/office/drawing/2014/chartex" xmlns:cx1="http://schemas.microsoft.com/office/drawing/2015/9/8/chartex" xmlns:cx2="http://schemas.microsoft.com/office/drawing/2015/10/21/chartex" xmlns:cx3="http://schemas.microsoft.com/office/drawing/2016/5/9/chartex" xmlns:cx4="http://schemas.microsoft.com/office/drawing/2016/5/10/chartex" xmlns:cx5="http://schemas.microsoft.com/office/drawing/2016/5/11/chartex" xmlns:cx6="http://schemas.microsoft.com/office/drawing/2016/5/12/chartex" xmlns:cx7="http://schemas.microsoft.com/office/drawing/2016/5/13/chartex" xmlns:cx8="http://schemas.microsoft.com/office/drawing/2016/5/14/chartex" xmlns:mc="http://schemas.openxmlformats.org/markup-compatibility/2006" xmlns:aink="http://schemas.microsoft.com/office/drawing/2016/ink" xmlns:am3d="http://schemas.microsoft.com/office/drawing/2017/model3d" xmlns:o="urn:schemas-microsoft-com:office:office" xmlns:oel="http://schemas.microsoft.com/office/2019/extlst" xmlns:r="http://schemas.openxmlformats.org/officeDocument/2006/relationships" xmlns:m="http://schemas.openxmlformats.org/officeDocument/2006/math" xmlns:v="urn:schemas-microsoft-com:vml" xmlns:wp14="http://schemas.microsoft.com/office/word/2010/wordprocessingDrawing" xmlns:wp="http://schemas.openxmlformats.org/drawingml/2006/wordprocessingDrawing" xmlns:w10="urn:schemas-microsoft-com:office:word" xmlns:w="http://schemas.openxmlformats.org/wordprocessingml/2006/main" xmlns:w14="http://schemas.microsoft.com/office/word/2010/wordml" xmlns:w15="http://schemas.microsoft.com/office/word/2012/wordml" xmlns:w16cex="http://schemas.microsoft.com/office/word/2018/wordml/cex" xmlns:w16cid="http://schemas.microsoft.com/office/word/2016/wordml/cid" xmlns:w16="http://schemas.microsoft.com/office/word/2018/wordml" xmlns:w16du="http://schemas.microsoft.com/office/word/2023/wordml/word16du" xmlns:w16sdtdh="http://schemas.microsoft.com/office/word/2020/wordml/sdtdatahash" xmlns:w16sdtfl="http://schemas.microsoft.com/office/word/2024/wordml/sdtformatlock" xmlns:w16se="http://schemas.microsoft.com/office/word/2015/wordml/symex" xmlns:wpg="http://schemas.microsoft.com/office/word/2010/wordprocessingGroup" xmlns:wpi="http://schemas.microsoft.com/office/word/2010/wordprocessingInk" xmlns:wne="http://schemas.microsoft.com/office/word/2006/wordml" xmlns:wps="http://schemas.microsoft.com/office/word/2010/wordprocessingShape" mc:Ignorable="w14 w15 w16se w16cid w16 w16cex w16sdtdh w16sdtfl w16du wp14">
   <w:abstractNum w:abstractNumId="0" w15:restartNumberingAfterBreak="0">
     <w:nsid w:val="03562F00"/>
     <w:multiLevelType w:val="hybridMultilevel"/>
@@ -3398,7 +3382,7 @@
 </file>
 
 <file path=word/styles.xml><?xml version="1.0" encoding="utf-8"?>
-<w:styles xmlns:mc="http://schemas.openxmlformats.org/markup-compatibility/2006" xmlns:r="http://schemas.openxmlformats.org/officeDocument/2006/relationships" xmlns:w="http://schemas.openxmlformats.org/wordprocessingml/2006/main" xmlns:w14="http://schemas.microsoft.com/office/word/2010/wordml" xmlns:w15="http://schemas.microsoft.com/office/word/2012/wordml" xmlns:w16cex="http://schemas.microsoft.com/office/word/2018/wordml/cex" xmlns:w16cid="http://schemas.microsoft.com/office/word/2016/wordml/cid" xmlns:w16="http://schemas.microsoft.com/office/word/2018/wordml" xmlns:w16sdtdh="http://schemas.microsoft.com/office/word/2020/wordml/sdtdatahash" xmlns:w16se="http://schemas.microsoft.com/office/word/2015/wordml/symex" mc:Ignorable="w14 w15 w16se w16cid w16 w16cex w16sdtdh">
+<w:styles xmlns:mc="http://schemas.openxmlformats.org/markup-compatibility/2006" xmlns:r="http://schemas.openxmlformats.org/officeDocument/2006/relationships" xmlns:w="http://schemas.openxmlformats.org/wordprocessingml/2006/main" xmlns:w14="http://schemas.microsoft.com/office/word/2010/wordml" xmlns:w15="http://schemas.microsoft.com/office/word/2012/wordml" xmlns:w16cex="http://schemas.microsoft.com/office/word/2018/wordml/cex" xmlns:w16cid="http://schemas.microsoft.com/office/word/2016/wordml/cid" xmlns:w16="http://schemas.microsoft.com/office/word/2018/wordml" xmlns:w16du="http://schemas.microsoft.com/office/word/2023/wordml/word16du" xmlns:w16sdtdh="http://schemas.microsoft.com/office/word/2020/wordml/sdtdatahash" xmlns:w16sdtfl="http://schemas.microsoft.com/office/word/2024/wordml/sdtformatlock" xmlns:w16se="http://schemas.microsoft.com/office/word/2015/wordml/symex" mc:Ignorable="w14 w15 w16se w16cid w16 w16cex w16sdtdh w16sdtfl w16du">
   <w:docDefaults>
     <w:rPrDefault>
       <w:rPr>
@@ -4138,10 +4122,21 @@
 </file>
 
 <file path=customXml/item1.xml><?xml version="1.0" encoding="utf-8"?>
-<b:Sources xmlns:b="http://schemas.openxmlformats.org/officeDocument/2006/bibliography" xmlns="http://schemas.openxmlformats.org/officeDocument/2006/bibliography" SelectedStyle="\APASixthEditionOfficeOnline.xsl" StyleName="APA" Version="6"/>
+<?mso-contentType ?>
+<FormTemplates xmlns="http://schemas.microsoft.com/sharepoint/v3/contenttype/forms">
+  <Display>DocumentLibraryForm</Display>
+  <Edit>DocumentLibraryForm</Edit>
+  <New>DocumentLibraryForm</New>
+</FormTemplates>
 </file>
 
 <file path=customXml/item2.xml><?xml version="1.0" encoding="utf-8"?>
+<p:properties xmlns:p="http://schemas.microsoft.com/office/2006/metadata/properties" xmlns:xsi="http://www.w3.org/2001/XMLSchema-instance" xmlns:pc="http://schemas.microsoft.com/office/infopath/2007/PartnerControls">
+  <documentManagement/>
+</p:properties>
+</file>
+
+<file path=customXml/item3.xml><?xml version="1.0" encoding="utf-8"?>
 <ct:contentTypeSchema xmlns:ct="http://schemas.microsoft.com/office/2006/metadata/contentType" xmlns:ma="http://schemas.microsoft.com/office/2006/metadata/properties/metaAttributes" ct:_="" ma:_="" ma:contentTypeName="Document" ma:contentTypeID="0x01010023FC7E3D89E3D64EAF0A5A832F4DE801" ma:contentTypeVersion="10" ma:contentTypeDescription="Create a new document." ma:contentTypeScope="" ma:versionID="1d3e30189d775e37ff5a575562b056a3">
   <xsd:schema xmlns:xsd="http://www.w3.org/2001/XMLSchema" xmlns:xs="http://www.w3.org/2001/XMLSchema" xmlns:p="http://schemas.microsoft.com/office/2006/metadata/properties" xmlns:ns3="a033743a-d49d-4b88-a523-f3cf14e77700" targetNamespace="http://schemas.microsoft.com/office/2006/metadata/properties" ma:root="true" ma:fieldsID="86d9ce8cef1075a3a77749bdfd882649" ns3:_="">
     <xsd:import namespace="a033743a-d49d-4b88-a523-f3cf14e77700"/>
@@ -4325,30 +4320,28 @@
 </ct:contentTypeSchema>
 </file>
 
-<file path=customXml/item3.xml><?xml version="1.0" encoding="utf-8"?>
-<p:properties xmlns:p="http://schemas.microsoft.com/office/2006/metadata/properties" xmlns:xsi="http://www.w3.org/2001/XMLSchema-instance" xmlns:pc="http://schemas.microsoft.com/office/infopath/2007/PartnerControls">
-  <documentManagement/>
-</p:properties>
-</file>
-
 <file path=customXml/item4.xml><?xml version="1.0" encoding="utf-8"?>
-<?mso-contentType ?>
-<FormTemplates xmlns="http://schemas.microsoft.com/sharepoint/v3/contenttype/forms">
-  <Display>DocumentLibraryForm</Display>
-  <Edit>DocumentLibraryForm</Edit>
-  <New>DocumentLibraryForm</New>
-</FormTemplates>
+<b:Sources xmlns:b="http://schemas.openxmlformats.org/officeDocument/2006/bibliography" xmlns="http://schemas.openxmlformats.org/officeDocument/2006/bibliography" SelectedStyle="\APASixthEditionOfficeOnline.xsl" StyleName="APA" Version="6"/>
 </file>
 
 <file path=customXml/itemProps1.xml><?xml version="1.0" encoding="utf-8"?>
-<ds:datastoreItem xmlns:ds="http://schemas.openxmlformats.org/officeDocument/2006/customXml" ds:itemID="{08E4E80C-B5B9-49E7-9BA5-0271EB6D258A}">
+<ds:datastoreItem xmlns:ds="http://schemas.openxmlformats.org/officeDocument/2006/customXml" ds:itemID="{53EA46C3-FC7B-4A2A-9339-46FF657C6C30}">
   <ds:schemaRefs>
-    <ds:schemaRef ds:uri="http://schemas.openxmlformats.org/officeDocument/2006/bibliography"/>
+    <ds:schemaRef ds:uri="http://schemas.microsoft.com/sharepoint/v3/contenttype/forms"/>
   </ds:schemaRefs>
 </ds:datastoreItem>
 </file>
 
 <file path=customXml/itemProps2.xml><?xml version="1.0" encoding="utf-8"?>
+<ds:datastoreItem xmlns:ds="http://schemas.openxmlformats.org/officeDocument/2006/customXml" ds:itemID="{98A50476-6057-4A0E-859A-429FFEBE6A3C}">
+  <ds:schemaRefs>
+    <ds:schemaRef ds:uri="http://schemas.microsoft.com/office/2006/metadata/properties"/>
+    <ds:schemaRef ds:uri="http://schemas.microsoft.com/office/infopath/2007/PartnerControls"/>
+  </ds:schemaRefs>
+</ds:datastoreItem>
+</file>
+
+<file path=customXml/itemProps3.xml><?xml version="1.0" encoding="utf-8"?>
 <ds:datastoreItem xmlns:ds="http://schemas.openxmlformats.org/officeDocument/2006/customXml" ds:itemID="{159B3534-0660-4C3B-940F-B2F42C3DD345}">
   <ds:schemaRefs>
     <ds:schemaRef ds:uri="http://schemas.microsoft.com/office/2006/metadata/contentType"/>
@@ -4366,19 +4359,10 @@
 </ds:datastoreItem>
 </file>
 
-<file path=customXml/itemProps3.xml><?xml version="1.0" encoding="utf-8"?>
-<ds:datastoreItem xmlns:ds="http://schemas.openxmlformats.org/officeDocument/2006/customXml" ds:itemID="{98A50476-6057-4A0E-859A-429FFEBE6A3C}">
+<file path=customXml/itemProps4.xml><?xml version="1.0" encoding="utf-8"?>
+<ds:datastoreItem xmlns:ds="http://schemas.openxmlformats.org/officeDocument/2006/customXml" ds:itemID="{08E4E80C-B5B9-49E7-9BA5-0271EB6D258A}">
   <ds:schemaRefs>
-    <ds:schemaRef ds:uri="http://schemas.microsoft.com/office/2006/metadata/properties"/>
-    <ds:schemaRef ds:uri="http://schemas.microsoft.com/office/infopath/2007/PartnerControls"/>
-  </ds:schemaRefs>
-</ds:datastoreItem>
-</file>
-
-<file path=customXml/itemProps4.xml><?xml version="1.0" encoding="utf-8"?>
-<ds:datastoreItem xmlns:ds="http://schemas.openxmlformats.org/officeDocument/2006/customXml" ds:itemID="{53EA46C3-FC7B-4A2A-9339-46FF657C6C30}">
-  <ds:schemaRefs>
-    <ds:schemaRef ds:uri="http://schemas.microsoft.com/sharepoint/v3/contenttype/forms"/>
+    <ds:schemaRef ds:uri="http://schemas.openxmlformats.org/officeDocument/2006/bibliography"/>
   </ds:schemaRefs>
 </ds:datastoreItem>
 </file>
</xml_diff>